<commit_message>
docs: add Soiree Suisse bullet to Looking Ahead
September 16 date is confirmed by the team. Venue and framing are
inferred from the event's history as a Swiss Embassy reception in
Washington; ABB's program at it is left as a TBD.

Co-Authored-By: Claude Opus 5 <noreply@anthropic.com>
Claude-Session: https://claude.ai/code/session_011q5eW4NuKCCzyAiWXMj3FD
</commit_message>
<xml_diff>
--- a/newsletters/Q3_2026_ABB_Newsletter_Draft.docx
+++ b/newsletters/Q3_2026_ABB_Newsletter_Draft.docx
@@ -636,6 +636,20 @@
       <w:r>
         <w:rPr/>
         <w:t>: ??</w:t>
+      </w:r>
+    </w:p>
+    <w:p>
+      <w:pPr>
+        <w:pStyle w:val="ListParagraph"/>
+        <w:numPr>
+          <w:ilvl w:val="0"/>
+          <w:numId w:val="2"/>
+        </w:numPr>
+        <w:rPr/>
+      </w:pPr>
+      <w:r>
+        <w:rPr/>
+        <w:t xml:space="preserve">Soirée Suisse: Swiss Embassy reception convening government, business, and diplomatic leaders, with ABB spotlighting [ABB program TBD] | Washington, D.C. (September 16, 2026)</w:t>
       </w:r>
     </w:p>
     <w:p>

</xml_diff>

<commit_message>
docs: fill in Congressional Grid Innovation Expo bullet
Details from the event invite: Sept 15 at the Rayburn House Office
Building, hosted by NEMA, GridWise Alliance, and the American Critical
Minerals Association with the House Grid Innovation Caucus. ABB's own
role at the event is left as a TBD.

Co-Authored-By: Claude Opus 5 <noreply@anthropic.com>
Claude-Session: https://claude.ai/code/session_011q5eW4NuKCCzyAiWXMj3FD
</commit_message>
<xml_diff>
--- a/newsletters/Q3_2026_ABB_Newsletter_Draft.docx
+++ b/newsletters/Q3_2026_ABB_Newsletter_Draft.docx
@@ -492,11 +492,7 @@
       </w:pPr>
       <w:r>
         <w:rPr/>
-        <w:t>Grid Expo</w:t>
-      </w:r>
-      <w:r>
-        <w:rPr/>
-        <w:t>: ??</w:t>
+        <w:t xml:space="preserve">Congressional Grid Innovation Expo: Grid technology showcase for Members and staff, hosted by NEMA, the GridWise Alliance, and the American Critical Minerals Association in conjunction with the House Grid Innovation Caucus, with ABB [participation TBD] | Rayburn House Office Building, Washington, D.C. (September 15, 2026)</w:t>
       </w:r>
     </w:p>
     <w:p>

</xml_diff>

<commit_message>
docs: add Roman Space Telescope feature to Q3 draft
New third feature on the ABB and Nuvu Cameras exoplanet camera readout
system aboard NASA's Nancy Grace Roman Space Telescope, drawn from the
August 30 press release.

Removes the duplicate one-line item from ABB in the News, which pointed
at the same press release the feature now links.

Co-Authored-By: Claude Opus 5 <noreply@anthropic.com>
Claude-Session: https://claude.ai/code/session_011q5eW4NuKCCzyAiWXMj3FD
</commit_message>
<xml_diff>
--- a/newsletters/Q3_2026_ABB_Newsletter_Draft.docx
+++ b/newsletters/Q3_2026_ABB_Newsletter_Draft.docx
@@ -304,6 +304,83 @@
           <w:iCs/>
         </w:rPr>
         <w:t>[Caption TBD]</w:t>
+      </w:r>
+    </w:p>
+    <w:p/>
+    <w:p>
+      <w:pPr>
+        <w:rPr>
+          <w:b w:val="1"/>
+          <w:bCs w:val="1"/>
+        </w:rPr>
+      </w:pPr>
+      <w:r>
+        <w:rPr>
+          <w:b w:val="1"/>
+          <w:bCs w:val="1"/>
+        </w:rPr>
+        <w:t xml:space="preserve">ABB Electronics Are Aboard NASA’s Newest Flagship Telescope</w:t>
+      </w:r>
+    </w:p>
+    <w:p>
+      <w:r>
+        <w:t xml:space="preserve">NASA’s Nancy Grace Roman Space Telescope </w:t>
+      </w:r>
+      <w:hyperlink r:id="R812b0f6a262b4736">
+        <w:r>
+          <w:rPr>
+            <w:rStyle w:val="Hyperlink"/>
+          </w:rPr>
+          <w:t xml:space="preserve">launched on August 30</w:t>
+        </w:r>
+      </w:hyperlink>
+      <w:r>
+        <w:t xml:space="preserve"> carrying ultra-sensitive camera electronics developed and manufactured by ABB with Nüvü Camēras. The electronics read out the Roman Coronagraph Instrument, a technology demonstration expected to be 100 to 1,000 times more powerful at imaging planets beyond our solar system than any space-based coronagraph flying today. NASA’s Jet Propulsion Laboratory awarded ABB the contract in 2020.</w:t>
+      </w:r>
+    </w:p>
+    <w:p/>
+    <w:p>
+      <w:r>
+        <w:t xml:space="preserve">The engineering problem is capturing almost nothing. Exoplanets are vastly dimmer than the stars they orbit, so the coronagraph suppresses starlight and steers the faint reflected light to the cameras. ABB compressed the readout system into a unit no larger than a shoe box, built from space-qualified components rated to survive deep-space radiation and cryogenic temperatures. The telescope operates at Lagrange point L2, roughly four times the distance from Earth to the Moon – far beyond the reach of the servicing missions that once repaired Hubble. Nothing out there can be repaired, so nothing can fail.</w:t>
+      </w:r>
+    </w:p>
+    <w:p/>
+    <w:p>
+      <w:r>
+        <w:t xml:space="preserve">Roman’s field of view is 100 times larger than Hubble’s, letting it survey far more sky in a single observation. It is named for NASA’s first chief of astronomy, known as the “mother of Hubble,” and it doubles as a proving ground for the Habitable Worlds Observatory, a future NASA mission concept that would search other planets for signs of habitability. The work draws on 30 years of ABB space projects and more than 140 optical systems now operating in orbit.</w:t>
+      </w:r>
+    </w:p>
+    <w:p/>
+    <w:p>
+      <w:r>
+        <w:t xml:space="preserve">“Projects like the Roman mission demonstrate what is possible when scientific ambition and engineering innovation come together,” said Marc Corriveau, General Manager of ABB’s Measurement &amp; Analytics division in Canada. “We are proud that technology developed by our space team in Quebec will contribute to this landmark NASA mission and support discoveries that could reshape our understanding of the universe.”</w:t>
+      </w:r>
+    </w:p>
+    <w:p/>
+    <w:p>
+      <w:pPr>
+        <w:jc w:val="center"/>
+      </w:pPr>
+      <w:r>
+        <w:rPr>
+          <w:i/>
+          <w:iCs/>
+        </w:rPr>
+        <w:t xml:space="preserve">[IMAGE TBD]</w:t>
+      </w:r>
+    </w:p>
+    <w:p>
+      <w:pPr>
+        <w:jc w:val="center"/>
+      </w:pPr>
+      <w:r>
+        <w:rPr>
+          <w:b w:val="1"/>
+          <w:bCs w:val="1"/>
+          <w:i/>
+          <w:iCs/>
+        </w:rPr>
+        <w:t xml:space="preserve">[Caption TBD]</w:t>
       </w:r>
     </w:p>
     <w:p/>
@@ -428,28 +505,6 @@
       <w:r>
         <w:fldChar w:fldCharType="end"/>
       </w:r>
-    </w:p>
-    <w:p>
-      <w:pPr>
-        <w:pStyle w:val="ListParagraph"/>
-        <w:numPr>
-          <w:ilvl w:val="0"/>
-          <w:numId w:val="2"/>
-        </w:numPr>
-        <w:rPr/>
-      </w:pPr>
-      <w:r>
-        <w:rPr/>
-        <w:t xml:space="preserve">August 2026 | </w:t>
-      </w:r>
-      <w:hyperlink r:id="R812b0f6a262b4736">
-        <w:r>
-          <w:rPr>
-            <w:rStyle w:val="Hyperlink"/>
-          </w:rPr>
-          <w:t>NASA launches powerful new space telescope with ABB technology onboard</w:t>
-        </w:r>
-      </w:hyperlink>
     </w:p>
     <w:p/>
     <w:p>

</xml_diff>